<commit_message>
Auto commit (2026-08-12 16:55) — 4 changes
Claude Code 세션 종료 시 자동 커밋.

Co-Authored-By: Claude <noreply@anthropic.com>
</commit_message>
<xml_diff>
--- a/projects/17_son_of_the_lamp/거지 알라딘과 요술램프_무료회차 1-8화_한국어 번역본_v3.docx
+++ b/projects/17_son_of_the_lamp/거지 알라딘과 요술램프_무료회차 1-8화_한국어 번역본_v3.docx
@@ -593,7 +593,7 @@
           <w:color w:val="1A1A1A"/>
           <w:sz w:val="23"/>
         </w:rPr>
-        <w:t>: 공주 전하, 폐하의 상태가 갈수록 나빠지고 있습니다. 지금 귀족들은 흔들리고 민심은 불안합니다. 왕실에는 강력한 보호자가 필요하지요. 제가 보기엔 할리드 경이 괜찮습니다. 그에게 시집가시면 혹시…</w:t>
+        <w:t>: 공주 전하, 폐하의 상태가 갈수록 나빠지고 있습니다. 지금 귀족들은 흔들리고 민심은 불안합니다. 왕실에는 강력한 보호자가 필요하지요. 제가 보기엔 할리드 경이 괜찮습니다. 그쪽과 혼인하시면 혹시…</w:t>
       </w:r>
     </w:p>
     <w:p>
@@ -686,7 +686,7 @@
           <w:color w:val="1A1A1A"/>
           <w:sz w:val="23"/>
         </w:rPr>
-        <w:t>: 내가 살아 있는 한, 카마르[^1]는 더러운 피가 흐르는 독수리 따위가 넘볼 수 없어! 당장, 나가! 내 아버지의 안식을 방해하지 마.</w:t>
+        <w:t>: 내가 살아 있는 한, 카마르는 더러운 피가 흐르는 독수리 따위가 넘볼 수 없어! 당장, 나가! 내 아버지의 안식을 방해하지 마.</w:t>
       </w:r>
     </w:p>
     <w:p>
@@ -764,7 +764,7 @@
           <w:color w:val="1A1A1A"/>
           <w:sz w:val="23"/>
         </w:rPr>
-        <w:t>(낮게, 사납게): 좋은 술을 마다하니…… 그럼 나를 원망하지 마시오…… 흥!</w:t>
+        <w:t>(낮게, 사납게): 좋은 술을 마다하니…… 그럼 원망은 마십시오…… 흥!</w:t>
       </w:r>
     </w:p>
     <w:p>
@@ -1541,7 +1541,7 @@
           <w:color w:val="1A1A1A"/>
           <w:sz w:val="23"/>
         </w:rPr>
-        <w:t>: 여러분, 좋은 밤입니다. 뭐 하시는 중입니까?</w:t>
+        <w:t>: 다들 안녕하십니까. 뭐 하시는 중입니까?</w:t>
       </w:r>
     </w:p>
     <w:p>
@@ -1861,7 +1861,7 @@
           <w:color w:val="1A1A1A"/>
           <w:sz w:val="23"/>
         </w:rPr>
-        <w:t>: 방금은 나를 죽이려던 것 같은데?</w:t>
+        <w:t>: 방금까진 죽이려고 들지 않았나?</w:t>
       </w:r>
     </w:p>
     <w:p>
@@ -2293,7 +2293,7 @@
           <w:color w:val="1A1A1A"/>
           <w:sz w:val="23"/>
         </w:rPr>
-        <w:t>(차갑게): 어젯밤 일은 없었던 걸로 해! 한 마디라도 발설하면, 죽여버리겠어!</w:t>
+        <w:t>(차갑게): 어젯밤 일은 없었던 걸로 해! 한마디라도 흘리면, 죽여버리겠어!</w:t>
       </w:r>
     </w:p>
     <w:p>
@@ -2482,7 +2482,7 @@
           <w:color w:val="1A1A1A"/>
           <w:sz w:val="23"/>
         </w:rPr>
-        <w:t>(중얼중얼): 화내지 마 소라야, 그가 널 구했잖아. 들개한테 한 입 물렸다고 치자!</w:t>
+        <w:t>(중얼중얼): 화내지 마, 소라야. 어쨌든 구해줬잖아. 들개한테 한 입 물렸다고 치자!</w:t>
       </w:r>
     </w:p>
     <w:p>
@@ -2668,7 +2668,7 @@
           <w:color w:val="1A1A1A"/>
           <w:sz w:val="23"/>
         </w:rPr>
-        <w:t>: 님, 저 방에 숙식 제공에 고액 급료라고 쓰여 있습니다! 한 달에 무려 금화 이백 닢입니다!</w:t>
+        <w:t>: 알라딘 님, 저 공고문에 숙식 제공에 고액 급료라고 쓰여 있습니다! 한 달에 무려 금화 이백 닢입니다!</w:t>
       </w:r>
     </w:p>
     <w:p>
@@ -2850,7 +2850,7 @@
           <w:color w:val="1A1A1A"/>
           <w:sz w:val="23"/>
         </w:rPr>
-        <w:t>(입을 딱 벌리고, 분노해서 양피지에 가위표를 그리며): 힘 조절, 영점! 다음 시험!</w:t>
+        <w:t>(입을 딱 벌리고, 분노해서 양피지에 가위표를 그리며): 힘 조절, 0점! 다음 시험!</w:t>
       </w:r>
     </w:p>
     <w:p>
@@ -2928,7 +2928,7 @@
           <w:color w:val="1A1A1A"/>
           <w:sz w:val="23"/>
         </w:rPr>
-        <w:t>(길길이 뛰며): 기술, 영점! 저쪽에 가서 서 있어!</w:t>
+        <w:t>(길길이 뛰며): 기술, 0점! 저쪽에 가서 서 있어!</w:t>
       </w:r>
     </w:p>
     <w:p>
@@ -3333,7 +3333,7 @@
           <w:color w:val="1A1A1A"/>
           <w:sz w:val="23"/>
         </w:rPr>
-        <w:t>(비굴한 말투): 오! 존귀하신 공주 전하, 분명 사람을 잘못 보셨습니다! 저는 어젯밤 내내 다리 밑에서 잤고, 어둡고 막다른 골목 같은 데는 절대 간 적 없으며, 선녀처럼 아름다운 여인은 더더욱 본 적이 없습니다!</w:t>
+        <w:t>(비굴한 말투): 오! 존귀하신 공주 전하, 분명 사람을 잘못 보셨습니다! 저는 어젯밤 내내 다리 밑에서 잤고, 어둡고 막다른 골목 같은 데는 절대 간 적 없으며, 여신처럼 아름다운 여인은 더더욱 본 적이 없습니다!</w:t>
       </w:r>
     </w:p>
     <w:p>
@@ -3567,7 +3567,7 @@
           <w:color w:val="444444"/>
           <w:sz w:val="21"/>
         </w:rPr>
-        <w:t>△ 대전[^2] 안. 바스마가 바닥에 떨어진 문서를 정리하고, 소라야는 씩씩거리며 탁자 앞에 돌아가 앉는다.</w:t>
+        <w:t>△ 침전 안. 바스마가 바닥에 떨어진 문서를 정리하고, 소라야는 씩씩거리며 탁자 앞에 돌아가 앉는다.</w:t>
       </w:r>
     </w:p>
     <w:p>
@@ -3606,7 +3606,7 @@
           <w:color w:val="1A1A1A"/>
           <w:sz w:val="23"/>
         </w:rPr>
-        <w:t>: 알라딘 님, 이 대전 안에 얌전치 못한 쥐가 한 마리 있는 것 같습니다.</w:t>
+        <w:t>: 알라딘 님, 이 침전 안에 얌전치 못한 쥐가 한 마리 있는 것 같습니다.</w:t>
       </w:r>
     </w:p>
     <w:p>
@@ -4400,7 +4400,7 @@
           <w:color w:val="1A1A1A"/>
           <w:sz w:val="23"/>
         </w:rPr>
-        <w:t>: 대전[^2]을 봉쇄해! 현장을 정리하고!</w:t>
+        <w:t>: 침전을 봉쇄해! 현장을 정리하고!</w:t>
       </w:r>
     </w:p>
     <w:p>
@@ -4484,7 +4484,7 @@
           <w:color w:val="1A1A1A"/>
           <w:sz w:val="23"/>
         </w:rPr>
-        <w:t>: 폐물! 소라야 하나 죽이겠다면서, 도망조차 못 치다니. 하지만 암영을 처리할 수 있는 자라면…… 그 정도 실력이면 최소한 대마법사급이다.</w:t>
+        <w:t>: 등신! 소라야 하나 죽이겠다면서, 도망조차 못 치다니. 하지만 암영을 처리할 수 있는 자라면…… 그 정도 실력이면 최소한 대마법사급이다.</w:t>
       </w:r>
     </w:p>
     <w:p>
@@ -4822,7 +4822,7 @@
           <w:color w:val="1A1A1A"/>
           <w:sz w:val="23"/>
         </w:rPr>
-        <w:t>: 소라야, 나의 아름다운 약혼녀. 드디어 나를 만나줄 마음이 든 거요?</w:t>
+        <w:t>: 소라야, 내 아름다운 약혼녀. 드디어 만나줄 마음이 든 거요?</w:t>
       </w:r>
     </w:p>
     <w:p>
@@ -4963,7 +4963,7 @@
           <w:color w:val="1A1A1A"/>
           <w:sz w:val="23"/>
         </w:rPr>
-        <w:t>(냉소): 좋게 대해주니 기어오르는군. 해.</w:t>
+        <w:t>(냉소): 좋게 대해주니 기어오르는군. 쳐라.</w:t>
       </w:r>
     </w:p>
     <w:p>
@@ -5056,7 +5056,7 @@
           <w:color w:val="1A1A1A"/>
           <w:sz w:val="23"/>
         </w:rPr>
-        <w:t>: 님, 이제 나서셔야 합니다.</w:t>
+        <w:t>: 알라딘 님, 이제 나서셔야 합니다.</w:t>
       </w:r>
     </w:p>
     <w:p>
@@ -5158,7 +5158,7 @@
           <w:color w:val="1A1A1A"/>
           <w:sz w:val="23"/>
         </w:rPr>
-        <w:t>: 오늘 여기서 말해두지. 네 폐물 호위 중 누구라도 내 손에서 한 수만 버티면, 나는 돌아서서 가겠다!</w:t>
+        <w:t>: 오늘 여기서 말해두지. 네 등신 호위 중 누구라도 내 손에서 한 수만 버티면, 그 자리에서 돌아가지!</w:t>
       </w:r>
     </w:p>
     <w:p>
@@ -5236,7 +5236,7 @@
           <w:color w:val="1A1A1A"/>
           <w:sz w:val="23"/>
         </w:rPr>
-        <w:t>: 나를 한 번이라도 건드리면, 태어난 걸 후회하게 만들어주지.</w:t>
+        <w:t>: 감히 한 번이라도 건드리면, 태어난 걸 후회하게 만들어주지.</w:t>
       </w:r>
     </w:p>
     <w:p>
@@ -5652,7 +5652,7 @@
           <w:color w:val="1A1A1A"/>
           <w:sz w:val="23"/>
         </w:rPr>
-        <w:t>: 소라야, 너 정말 미쳤구나. 이런 하급 호위로 나를 막겠다고?</w:t>
+        <w:t>: 소라야, 너 정말 미쳤구나. 저런 하급 호위한테 날 막으라고?</w:t>
       </w:r>
     </w:p>
     <w:p>
@@ -5838,7 +5838,7 @@
           <w:color w:val="1A1A1A"/>
           <w:sz w:val="23"/>
         </w:rPr>
-        <w:t>: 폐물! 아주 그럴싸하게 구는군. 소라야가 한 달에 얼마를 주지, 금화 열 닢? 스무 닢? 그깟 돈에 내 앞에서 목숨을 걸겠다고?</w:t>
+        <w:t>: 등신! 아주 그럴싸하게 구는군. 소라야가 한 달에 얼마를 주지, 금화 열 닢? 스무 닢? 그깟 돈에 내 앞에서 목숨을 걸겠다고?</w:t>
       </w:r>
     </w:p>
     <w:p>
@@ -5877,7 +5877,7 @@
           <w:color w:val="1A1A1A"/>
           <w:sz w:val="23"/>
         </w:rPr>
-        <w:t>(낯빛이 굳었다가[^3], 이내 사납게 웃으며): 잘 들어라 폐물! 지금, 무릎 꿇고 내 장화를 깨끗이 핥아라! 자비를 베풀어 다리 하나만 부러뜨려 줄지도 모르니!</w:t>
+        <w:t>(낯빛이 굳었다가, 이내 사납게 웃으며): 잘 들어라 등신! 지금, 무릎 꿇고 내 장화를 깨끗이 핥아라! 자비를 베풀어 다리 하나만 부러뜨려 줄지도 모르니!</w:t>
       </w:r>
     </w:p>
     <w:p>
@@ -6033,7 +6033,7 @@
           <w:color w:val="1A1A1A"/>
           <w:sz w:val="23"/>
         </w:rPr>
-        <w:t>(분노): 좋아, 쓰레기! 마음이 바뀌었다. 지금, 너를 직접 죽여주마!</w:t>
+        <w:t>(분노): 좋아, 쓰레기! 마음이 바뀌었다. 지금, 여기서 직접 죽여주마!</w:t>
       </w:r>
     </w:p>
     <w:p>
@@ -6614,7 +6614,7 @@
           <w:color w:val="1A1A1A"/>
           <w:sz w:val="23"/>
         </w:rPr>
-        <w:t>: 때리지 마! 나를 때리지 마!</w:t>
+        <w:t>: 때리지 마! 때리지 마세요!</w:t>
       </w:r>
     </w:p>
     <w:p>
@@ -6653,7 +6653,7 @@
           <w:color w:val="1A1A1A"/>
           <w:sz w:val="23"/>
         </w:rPr>
-        <w:t>(억지로 기세를 세우며): 흥! 네가 감히 나를 건드릴 리 없지! 하급 호위 주제에 머리는 좀 돌아가는군! 지금 당장 나에게——</w:t>
+        <w:t>(억지로 기세를 세우며): 흥! 감히 못 건드릴 줄 알았다! 하급 호위 주제에 머리는 좀 돌아가는군! 지금 당장——</w:t>
       </w:r>
     </w:p>
     <w:p>
@@ -6722,7 +6722,7 @@
           <w:color w:val="1A1A1A"/>
           <w:sz w:val="23"/>
         </w:rPr>
-        <w:t>(얼굴이 간처럼 시뻘게져): 보지 마! 아무도 보지 마! 이 빌어먹을 자식, 내가 반드시……</w:t>
+        <w:t>(얼굴이 시뻘겋게 달아올라): 보지 마! 아무도 보지 마! 이 빌어먹을 자식, 내가 반드시……</w:t>
       </w:r>
     </w:p>
     <w:p>
@@ -6992,7 +6992,7 @@
           <w:color w:val="1A1A1A"/>
           <w:sz w:val="23"/>
         </w:rPr>
-        <w:t>(쉰 목소리): 안녕하신가, 두 분. 아무래도 누군가 나를 불러 자잘한 장애물을 좀 치워달라는 모양이군.</w:t>
+        <w:t>(쉰 목소리): 안녕하신가, 두 분. 아무래도 누가 자잘한 장애물 좀 치워달라던데.</w:t>
       </w:r>
     </w:p>
     <w:p>
@@ -7849,7 +7849,7 @@
           <w:color w:val="1A1A1A"/>
           <w:sz w:val="23"/>
         </w:rPr>
-        <w:t>(흉하게 웃으며): 체념해라. 이 세상에 너를 구할 수 있는 자는 없다!</w:t>
+        <w:t>(흉하게 웃으며): 체념해라. 이 세상에 널 구할 수 있는 자는 없다!</w:t>
       </w:r>
     </w:p>
     <w:p>

</xml_diff>